<commit_message>
Deixa o guia de gestao apenas com as perguntas, sem os comentarios
</commit_message>
<xml_diff>
--- a/1on1/Guia 1on1 - cargos de gestao.docx
+++ b/1on1/Guia 1on1 - cargos de gestao.docx
@@ -105,20 +105,6 @@
           <w:color w:val="141414"/>
           <w:sz w:val="26"/>
         </w:rPr>
-        <w:t>O texto pequeno em cinza embaixo de algumas perguntas é só para mim, é o que eu quero observar na resposta. Não precisa ler para a pessoa.</w:t>
-      </w:r>
-    </w:p>
-    <w:p>
-      <w:pPr>
-        <w:spacing w:after="180" w:before="0"/>
-      </w:pPr>
-      <w:r>
-        <w:rPr>
-          <w:rFonts w:ascii="Arial" w:hAnsi="Arial"/>
-          <w:b w:val="0"/>
-          <w:color w:val="141414"/>
-          <w:sz w:val="26"/>
-        </w:rPr>
         <w:t>O que muda de um cargo para o outro: no diretor eu pergunto se a área entrega. Na vice, se as áreas entregam sem ela. Na presidência, se o clube continua de pé sem quem está lá hoje.</w:t>
         <w:br w:type="page"/>
       </w:r>
@@ -153,7 +139,7 @@
     </w:p>
     <w:p>
       <w:pPr>
-        <w:spacing w:after="40" w:before="160"/>
+        <w:spacing w:after="40" w:before="200"/>
       </w:pPr>
       <w:r>
         <w:rPr>
@@ -167,7 +153,7 @@
     </w:p>
     <w:p>
       <w:pPr>
-        <w:spacing w:after="60" w:before="0"/>
+        <w:spacing w:after="80" w:before="0"/>
       </w:pPr>
       <w:r>
         <w:rPr>
@@ -181,21 +167,7 @@
     </w:p>
     <w:p>
       <w:pPr>
-        <w:spacing w:after="40" w:before="0"/>
-      </w:pPr>
-      <w:r>
-        <w:rPr>
-          <w:rFonts w:ascii="Arial" w:hAnsi="Arial"/>
-          <w:b w:val="0"/>
-          <w:color w:val="5E5E5E"/>
-          <w:sz w:val="21"/>
-        </w:rPr>
-        <w:t>Se não existe nada que comprove, a área está sendo conduzida por sensação.</w:t>
-      </w:r>
-    </w:p>
-    <w:p>
-      <w:pPr>
-        <w:spacing w:after="40" w:before="160"/>
+        <w:spacing w:after="40" w:before="200"/>
       </w:pPr>
       <w:r>
         <w:rPr>
@@ -209,7 +181,7 @@
     </w:p>
     <w:p>
       <w:pPr>
-        <w:spacing w:after="60" w:before="0"/>
+        <w:spacing w:after="80" w:before="0"/>
       </w:pPr>
       <w:r>
         <w:rPr>
@@ -223,21 +195,7 @@
     </w:p>
     <w:p>
       <w:pPr>
-        <w:spacing w:after="40" w:before="0"/>
-      </w:pPr>
-      <w:r>
-        <w:rPr>
-          <w:rFonts w:ascii="Arial" w:hAnsi="Arial"/>
-          <w:b w:val="0"/>
-          <w:color w:val="5E5E5E"/>
-          <w:sz w:val="21"/>
-        </w:rPr>
-        <w:t>Teste direto de sucessão e de documentação.</w:t>
-      </w:r>
-    </w:p>
-    <w:p>
-      <w:pPr>
-        <w:spacing w:after="40" w:before="160"/>
+        <w:spacing w:after="40" w:before="200"/>
       </w:pPr>
       <w:r>
         <w:rPr>
@@ -251,7 +209,7 @@
     </w:p>
     <w:p>
       <w:pPr>
-        <w:spacing w:after="60" w:before="0"/>
+        <w:spacing w:after="80" w:before="0"/>
       </w:pPr>
       <w:r>
         <w:rPr>
@@ -265,21 +223,7 @@
     </w:p>
     <w:p>
       <w:pPr>
-        <w:spacing w:after="40" w:before="0"/>
-      </w:pPr>
-      <w:r>
-        <w:rPr>
-          <w:rFonts w:ascii="Arial" w:hAnsi="Arial"/>
-          <w:b w:val="0"/>
-          <w:color w:val="5E5E5E"/>
-          <w:sz w:val="21"/>
-        </w:rPr>
-        <w:t>Se não consegue falar nome por nome, não está acompanhando ninguém, está distribuindo tarefa.</w:t>
-      </w:r>
-    </w:p>
-    <w:p>
-      <w:pPr>
-        <w:spacing w:after="40" w:before="160"/>
+        <w:spacing w:after="40" w:before="200"/>
       </w:pPr>
       <w:r>
         <w:rPr>
@@ -293,7 +237,7 @@
     </w:p>
     <w:p>
       <w:pPr>
-        <w:spacing w:after="60" w:before="0"/>
+        <w:spacing w:after="80" w:before="0"/>
       </w:pPr>
       <w:r>
         <w:rPr>
@@ -307,21 +251,7 @@
     </w:p>
     <w:p>
       <w:pPr>
-        <w:spacing w:after="40" w:before="0"/>
-      </w:pPr>
-      <w:r>
-        <w:rPr>
-          <w:rFonts w:ascii="Arial" w:hAnsi="Arial"/>
-          <w:b w:val="0"/>
-          <w:color w:val="5E5E5E"/>
-          <w:sz w:val="21"/>
-        </w:rPr>
-        <w:t>Mede se ele enxerga a saída antes de ela acontecer, e se está fazendo algo a respeito.</w:t>
-      </w:r>
-    </w:p>
-    <w:p>
-      <w:pPr>
-        <w:spacing w:after="40" w:before="160"/>
+        <w:spacing w:after="40" w:before="200"/>
       </w:pPr>
       <w:r>
         <w:rPr>
@@ -335,7 +265,7 @@
     </w:p>
     <w:p>
       <w:pPr>
-        <w:spacing w:after="60" w:before="0"/>
+        <w:spacing w:after="80" w:before="0"/>
       </w:pPr>
       <w:r>
         <w:rPr>
@@ -345,20 +275,6 @@
           <w:sz w:val="32"/>
         </w:rPr>
         <w:t>De 0 a 10, quanto sua área funcionaria bem sem você por um mês? O que explica não ser 10?</w:t>
-      </w:r>
-    </w:p>
-    <w:p>
-      <w:pPr>
-        <w:spacing w:after="80" w:before="240"/>
-      </w:pPr>
-      <w:r>
-        <w:rPr>
-          <w:rFonts w:ascii="Arial" w:hAnsi="Arial"/>
-          <w:b w:val="0"/>
-          <w:color w:val="5E5E5E"/>
-          <w:sz w:val="21"/>
-        </w:rPr>
-        <w:t>Vêm de D1, D3, D4, D5 e D9 do banco completo.</w:t>
         <w:br w:type="page"/>
       </w:r>
     </w:p>
@@ -392,7 +308,7 @@
     </w:p>
     <w:p>
       <w:pPr>
-        <w:spacing w:after="40" w:before="160"/>
+        <w:spacing w:after="40" w:before="200"/>
       </w:pPr>
       <w:r>
         <w:rPr>
@@ -406,7 +322,7 @@
     </w:p>
     <w:p>
       <w:pPr>
-        <w:spacing w:after="60" w:before="0"/>
+        <w:spacing w:after="80" w:before="0"/>
       </w:pPr>
       <w:r>
         <w:rPr>
@@ -420,21 +336,7 @@
     </w:p>
     <w:p>
       <w:pPr>
-        <w:spacing w:after="40" w:before="0"/>
-      </w:pPr>
-      <w:r>
-        <w:rPr>
-          <w:rFonts w:ascii="Arial" w:hAnsi="Arial"/>
-          <w:b w:val="0"/>
-          <w:color w:val="5E5E5E"/>
-          <w:sz w:val="21"/>
-        </w:rPr>
-        <w:t>Se não sabe responder, o cargo está sendo exercido como assistência à presidência, e é isso que precisa ser tratado.</w:t>
-      </w:r>
-    </w:p>
-    <w:p>
-      <w:pPr>
-        <w:spacing w:after="40" w:before="160"/>
+        <w:spacing w:after="40" w:before="200"/>
       </w:pPr>
       <w:r>
         <w:rPr>
@@ -448,7 +350,7 @@
     </w:p>
     <w:p>
       <w:pPr>
-        <w:spacing w:after="60" w:before="0"/>
+        <w:spacing w:after="80" w:before="0"/>
       </w:pPr>
       <w:r>
         <w:rPr>
@@ -462,7 +364,7 @@
     </w:p>
     <w:p>
       <w:pPr>
-        <w:spacing w:after="40" w:before="160"/>
+        <w:spacing w:after="40" w:before="200"/>
       </w:pPr>
       <w:r>
         <w:rPr>
@@ -476,7 +378,7 @@
     </w:p>
     <w:p>
       <w:pPr>
-        <w:spacing w:after="60" w:before="0"/>
+        <w:spacing w:after="80" w:before="0"/>
       </w:pPr>
       <w:r>
         <w:rPr>
@@ -490,21 +392,7 @@
     </w:p>
     <w:p>
       <w:pPr>
-        <w:spacing w:after="40" w:before="0"/>
-      </w:pPr>
-      <w:r>
-        <w:rPr>
-          <w:rFonts w:ascii="Arial" w:hAnsi="Arial"/>
-          <w:b w:val="0"/>
-          <w:color w:val="5E5E5E"/>
-          <w:sz w:val="21"/>
-        </w:rPr>
-        <w:t>Sem sinal antecedente, a vice só apaga incêndio. Dá para usar as notas de retenção dos 1on1 como alarme.</w:t>
-      </w:r>
-    </w:p>
-    <w:p>
-      <w:pPr>
-        <w:spacing w:after="40" w:before="160"/>
+        <w:spacing w:after="40" w:before="200"/>
       </w:pPr>
       <w:r>
         <w:rPr>
@@ -518,7 +406,7 @@
     </w:p>
     <w:p>
       <w:pPr>
-        <w:spacing w:after="60" w:before="0"/>
+        <w:spacing w:after="80" w:before="0"/>
       </w:pPr>
       <w:r>
         <w:rPr>
@@ -532,21 +420,7 @@
     </w:p>
     <w:p>
       <w:pPr>
-        <w:spacing w:after="40" w:before="0"/>
-      </w:pPr>
-      <w:r>
-        <w:rPr>
-          <w:rFonts w:ascii="Arial" w:hAnsi="Arial"/>
-          <w:b w:val="0"/>
-          <w:color w:val="5E5E5E"/>
-          <w:sz w:val="21"/>
-        </w:rPr>
-        <w:t>Se não souber de cabeça, o achado já é a própria resposta. O Gabriel apontou que estamos com poucos membros, então esse número precisa ter dono.</w:t>
-      </w:r>
-    </w:p>
-    <w:p>
-      <w:pPr>
-        <w:spacing w:after="40" w:before="160"/>
+        <w:spacing w:after="40" w:before="200"/>
       </w:pPr>
       <w:r>
         <w:rPr>
@@ -560,7 +434,7 @@
     </w:p>
     <w:p>
       <w:pPr>
-        <w:spacing w:after="60" w:before="0"/>
+        <w:spacing w:after="80" w:before="0"/>
       </w:pPr>
       <w:r>
         <w:rPr>
@@ -570,20 +444,6 @@
           <w:sz w:val="32"/>
         </w:rPr>
         <w:t>De 0 a 10, quanto o clube funcionaria se você e a presidência saíssem no mesmo semestre? O que explica o número?</w:t>
-      </w:r>
-    </w:p>
-    <w:p>
-      <w:pPr>
-        <w:spacing w:after="80" w:before="240"/>
-      </w:pPr>
-      <w:r>
-        <w:rPr>
-          <w:rFonts w:ascii="Arial" w:hAnsi="Arial"/>
-          <w:b w:val="0"/>
-          <w:color w:val="5E5E5E"/>
-          <w:sz w:val="21"/>
-        </w:rPr>
-        <w:t>Vêm de V1, V2, V3, V4 e V10 do banco completo.</w:t>
         <w:br w:type="page"/>
       </w:r>
     </w:p>
@@ -617,7 +477,7 @@
     </w:p>
     <w:p>
       <w:pPr>
-        <w:spacing w:after="40" w:before="160"/>
+        <w:spacing w:after="40" w:before="200"/>
       </w:pPr>
       <w:r>
         <w:rPr>
@@ -631,7 +491,7 @@
     </w:p>
     <w:p>
       <w:pPr>
-        <w:spacing w:after="60" w:before="0"/>
+        <w:spacing w:after="80" w:before="0"/>
       </w:pPr>
       <w:r>
         <w:rPr>
@@ -645,7 +505,7 @@
     </w:p>
     <w:p>
       <w:pPr>
-        <w:spacing w:after="40" w:before="160"/>
+        <w:spacing w:after="40" w:before="200"/>
       </w:pPr>
       <w:r>
         <w:rPr>
@@ -659,7 +519,7 @@
     </w:p>
     <w:p>
       <w:pPr>
-        <w:spacing w:after="60" w:before="0"/>
+        <w:spacing w:after="80" w:before="0"/>
       </w:pPr>
       <w:r>
         <w:rPr>
@@ -673,21 +533,7 @@
     </w:p>
     <w:p>
       <w:pPr>
-        <w:spacing w:after="40" w:before="0"/>
-      </w:pPr>
-      <w:r>
-        <w:rPr>
-          <w:rFonts w:ascii="Arial" w:hAnsi="Arial"/>
-          <w:b w:val="0"/>
-          <w:color w:val="5E5E5E"/>
-          <w:sz w:val="21"/>
-        </w:rPr>
-        <w:t>Se não existem números, a gestão é por percepção. E comparar com o que os diretores respondem em D1 mostra se todos olham a mesma coisa.</w:t>
-      </w:r>
-    </w:p>
-    <w:p>
-      <w:pPr>
-        <w:spacing w:after="40" w:before="160"/>
+        <w:spacing w:after="40" w:before="200"/>
       </w:pPr>
       <w:r>
         <w:rPr>
@@ -701,7 +547,7 @@
     </w:p>
     <w:p>
       <w:pPr>
-        <w:spacing w:after="60" w:before="0"/>
+        <w:spacing w:after="80" w:before="0"/>
       </w:pPr>
       <w:r>
         <w:rPr>
@@ -715,21 +561,7 @@
     </w:p>
     <w:p>
       <w:pPr>
-        <w:spacing w:after="40" w:before="0"/>
-      </w:pPr>
-      <w:r>
-        <w:rPr>
-          <w:rFonts w:ascii="Arial" w:hAnsi="Arial"/>
-          <w:b w:val="0"/>
-          <w:color w:val="5E5E5E"/>
-          <w:sz w:val="21"/>
-        </w:rPr>
-        <w:t>O CCU se posiciona como preparação para consultoria. Vale confrontar com a nota que os membros se dão de prontidão para PS.</w:t>
-      </w:r>
-    </w:p>
-    <w:p>
-      <w:pPr>
-        <w:spacing w:after="40" w:before="160"/>
+        <w:spacing w:after="40" w:before="200"/>
       </w:pPr>
       <w:r>
         <w:rPr>
@@ -743,7 +575,7 @@
     </w:p>
     <w:p>
       <w:pPr>
-        <w:spacing w:after="60" w:before="0"/>
+        <w:spacing w:after="80" w:before="0"/>
       </w:pPr>
       <w:r>
         <w:rPr>
@@ -757,7 +589,7 @@
     </w:p>
     <w:p>
       <w:pPr>
-        <w:spacing w:after="40" w:before="160"/>
+        <w:spacing w:after="40" w:before="200"/>
       </w:pPr>
       <w:r>
         <w:rPr>
@@ -771,7 +603,7 @@
     </w:p>
     <w:p>
       <w:pPr>
-        <w:spacing w:after="60" w:before="0"/>
+        <w:spacing w:after="80" w:before="0"/>
       </w:pPr>
       <w:r>
         <w:rPr>
@@ -781,20 +613,6 @@
           <w:sz w:val="32"/>
         </w:rPr>
         <w:t>De 0 a 10, quanto o clube estaria de pé daqui a dois anos se ninguém da diretoria atual continuasse? O que explica o número?</w:t>
-      </w:r>
-    </w:p>
-    <w:p>
-      <w:pPr>
-        <w:spacing w:after="80" w:before="240"/>
-      </w:pPr>
-      <w:r>
-        <w:rPr>
-          <w:rFonts w:ascii="Arial" w:hAnsi="Arial"/>
-          <w:b w:val="0"/>
-          <w:color w:val="5E5E5E"/>
-          <w:sz w:val="21"/>
-        </w:rPr>
-        <w:t>Vêm de P1, P2, P3, P7 e P10 do banco completo.</w:t>
         <w:br w:type="page"/>
       </w:r>
     </w:p>
@@ -828,7 +646,7 @@
     </w:p>
     <w:p>
       <w:pPr>
-        <w:spacing w:after="40" w:before="160"/>
+        <w:spacing w:after="40" w:before="200"/>
       </w:pPr>
       <w:r>
         <w:rPr>
@@ -842,7 +660,7 @@
     </w:p>
     <w:p>
       <w:pPr>
-        <w:spacing w:after="60" w:before="0"/>
+        <w:spacing w:after="80" w:before="0"/>
       </w:pPr>
       <w:r>
         <w:rPr>
@@ -856,7 +674,7 @@
     </w:p>
     <w:p>
       <w:pPr>
-        <w:spacing w:after="40" w:before="160"/>
+        <w:spacing w:after="40" w:before="200"/>
       </w:pPr>
       <w:r>
         <w:rPr>
@@ -870,7 +688,7 @@
     </w:p>
     <w:p>
       <w:pPr>
-        <w:spacing w:after="60" w:before="0"/>
+        <w:spacing w:after="80" w:before="0"/>
       </w:pPr>
       <w:r>
         <w:rPr>
@@ -884,21 +702,7 @@
     </w:p>
     <w:p>
       <w:pPr>
-        <w:spacing w:after="40" w:before="0"/>
-      </w:pPr>
-      <w:r>
-        <w:rPr>
-          <w:rFonts w:ascii="Arial" w:hAnsi="Arial"/>
-          <w:b w:val="0"/>
-          <w:color w:val="5E5E5E"/>
-          <w:sz w:val="21"/>
-        </w:rPr>
-        <w:t>Quem não lembra de nenhuma provavelmente não está decidindo, está reagindo.</w:t>
-      </w:r>
-    </w:p>
-    <w:p>
-      <w:pPr>
-        <w:spacing w:after="40" w:before="160"/>
+        <w:spacing w:after="40" w:before="200"/>
       </w:pPr>
       <w:r>
         <w:rPr>
@@ -912,7 +716,7 @@
     </w:p>
     <w:p>
       <w:pPr>
-        <w:spacing w:after="60" w:before="0"/>
+        <w:spacing w:after="80" w:before="0"/>
       </w:pPr>
       <w:r>
         <w:rPr>
@@ -926,7 +730,7 @@
     </w:p>
     <w:p>
       <w:pPr>
-        <w:spacing w:after="40" w:before="160"/>
+        <w:spacing w:after="40" w:before="200"/>
       </w:pPr>
       <w:r>
         <w:rPr>
@@ -940,7 +744,7 @@
     </w:p>
     <w:p>
       <w:pPr>
-        <w:spacing w:after="60" w:before="0"/>
+        <w:spacing w:after="80" w:before="0"/>
       </w:pPr>
       <w:r>
         <w:rPr>
@@ -954,7 +758,7 @@
     </w:p>
     <w:p>
       <w:pPr>
-        <w:spacing w:after="40" w:before="160"/>
+        <w:spacing w:after="40" w:before="200"/>
       </w:pPr>
       <w:r>
         <w:rPr>
@@ -968,7 +772,7 @@
     </w:p>
     <w:p>
       <w:pPr>
-        <w:spacing w:after="60" w:before="0"/>
+        <w:spacing w:after="80" w:before="0"/>
       </w:pPr>
       <w:r>
         <w:rPr>
@@ -982,35 +786,7 @@
     </w:p>
     <w:p>
       <w:pPr>
-        <w:spacing w:after="40" w:before="0"/>
-      </w:pPr>
-      <w:r>
-        <w:rPr>
-          <w:rFonts w:ascii="Arial" w:hAnsi="Arial"/>
-          <w:b w:val="0"/>
-          <w:color w:val="5E5E5E"/>
-          <w:sz w:val="21"/>
-        </w:rPr>
-        <w:t>Fecha bem e já produz o combinado da conversa, que é o campo que mais fica vazio no registro.</w:t>
-      </w:r>
-    </w:p>
-    <w:p>
-      <w:pPr>
-        <w:spacing w:after="80" w:before="240"/>
-      </w:pPr>
-      <w:r>
-        <w:rPr>
-          <w:rFonts w:ascii="Arial" w:hAnsi="Arial"/>
-          <w:b w:val="0"/>
-          <w:color w:val="5E5E5E"/>
-          <w:sz w:val="21"/>
-        </w:rPr>
-        <w:t>G1, G3, G4 e G5 vêm de G1 a G4 do banco. G2 é a antiga D6, trazida para cá porque serve aos três cargos.</w:t>
-      </w:r>
-    </w:p>
-    <w:p>
-      <w:pPr>
-        <w:spacing w:after="80" w:before="0"/>
+        <w:spacing w:after="80" w:before="280"/>
       </w:pPr>
       <w:r>
         <w:rPr>

</xml_diff>